<commit_message>
Changes introduced for error are reverted
</commit_message>
<xml_diff>
--- a/2022bcs0187_Mlops_Lab7.docx
+++ b/2022bcs0187_Mlops_Lab7.docx
@@ -364,6 +364,118 @@
           <w:szCs w:val="40"/>
         </w:rPr>
         <w:t>Failed pipeline run (after induced error)</w:t>
+      </w:r>
+    </w:p>
+    <w:p>
+      <w:pPr>
+        <w:ind w:left="360"/>
+        <w:rPr>
+          <w:b/>
+          <w:bCs/>
+          <w:smallCaps/>
+          <w:color w:val="830F0E" w:themeColor="accent1" w:themeShade="BF"/>
+          <w:spacing w:val="5"/>
+          <w:sz w:val="40"/>
+          <w:szCs w:val="40"/>
+        </w:rPr>
+      </w:pPr>
+      <w:r>
+        <w:drawing>
+          <wp:inline distT="0" distB="0" distL="0" distR="0" wp14:anchorId="45F3D8C2" wp14:editId="3C792A4A">
+            <wp:extent cx="5731510" cy="2774315"/>
+            <wp:effectExtent l="0" t="0" r="2540" b="6985"/>
+            <wp:docPr id="1318332958" name="Picture 1"/>
+            <wp:cNvGraphicFramePr>
+              <a:graphicFrameLocks xmlns:a="http://schemas.openxmlformats.org/drawingml/2006/main" noChangeAspect="1"/>
+            </wp:cNvGraphicFramePr>
+            <a:graphic xmlns:a="http://schemas.openxmlformats.org/drawingml/2006/main">
+              <a:graphicData uri="http://schemas.openxmlformats.org/drawingml/2006/picture">
+                <pic:pic xmlns:pic="http://schemas.openxmlformats.org/drawingml/2006/picture">
+                  <pic:nvPicPr>
+                    <pic:cNvPr id="1318332958" name=""/>
+                    <pic:cNvPicPr/>
+                  </pic:nvPicPr>
+                  <pic:blipFill>
+                    <a:blip r:embed="rId7"/>
+                    <a:stretch>
+                      <a:fillRect/>
+                    </a:stretch>
+                  </pic:blipFill>
+                  <pic:spPr>
+                    <a:xfrm>
+                      <a:off x="0" y="0"/>
+                      <a:ext cx="5731510" cy="2774315"/>
+                    </a:xfrm>
+                    <a:prstGeom prst="rect">
+                      <a:avLst/>
+                    </a:prstGeom>
+                  </pic:spPr>
+                </pic:pic>
+              </a:graphicData>
+            </a:graphic>
+          </wp:inline>
+        </w:drawing>
+      </w:r>
+    </w:p>
+    <w:p>
+      <w:pPr>
+        <w:ind w:left="360"/>
+        <w:rPr>
+          <w:b/>
+          <w:bCs/>
+          <w:smallCaps/>
+          <w:color w:val="830F0E" w:themeColor="accent1" w:themeShade="BF"/>
+          <w:spacing w:val="5"/>
+          <w:sz w:val="40"/>
+          <w:szCs w:val="40"/>
+        </w:rPr>
+      </w:pPr>
+      <w:r>
+        <w:rPr>
+          <w:b/>
+          <w:bCs/>
+          <w:smallCaps/>
+          <w:color w:val="830F0E" w:themeColor="accent1" w:themeShade="BF"/>
+          <w:spacing w:val="5"/>
+          <w:sz w:val="40"/>
+          <w:szCs w:val="40"/>
+        </w:rPr>
+        <w:lastRenderedPageBreak/>
+        <w:drawing>
+          <wp:inline distT="0" distB="0" distL="0" distR="0" wp14:anchorId="46A3986F" wp14:editId="7B721AE6">
+            <wp:extent cx="5731510" cy="2675255"/>
+            <wp:effectExtent l="0" t="0" r="2540" b="0"/>
+            <wp:docPr id="2118116336" name="Picture 1"/>
+            <wp:cNvGraphicFramePr>
+              <a:graphicFrameLocks xmlns:a="http://schemas.openxmlformats.org/drawingml/2006/main" noChangeAspect="1"/>
+            </wp:cNvGraphicFramePr>
+            <a:graphic xmlns:a="http://schemas.openxmlformats.org/drawingml/2006/main">
+              <a:graphicData uri="http://schemas.openxmlformats.org/drawingml/2006/picture">
+                <pic:pic xmlns:pic="http://schemas.openxmlformats.org/drawingml/2006/picture">
+                  <pic:nvPicPr>
+                    <pic:cNvPr id="2118116336" name=""/>
+                    <pic:cNvPicPr/>
+                  </pic:nvPicPr>
+                  <pic:blipFill>
+                    <a:blip r:embed="rId8"/>
+                    <a:stretch>
+                      <a:fillRect/>
+                    </a:stretch>
+                  </pic:blipFill>
+                  <pic:spPr>
+                    <a:xfrm>
+                      <a:off x="0" y="0"/>
+                      <a:ext cx="5731510" cy="2675255"/>
+                    </a:xfrm>
+                    <a:prstGeom prst="rect">
+                      <a:avLst/>
+                    </a:prstGeom>
+                  </pic:spPr>
+                </pic:pic>
+              </a:graphicData>
+            </a:graphic>
+          </wp:inline>
+        </w:drawing>
       </w:r>
     </w:p>
     <w:p>

</xml_diff>